<commit_message>
Attribute indoor monitoring finding to TBIJ and UBDC study
Co-Authored-By: Claude Opus 5.5 <noreply@anthropic.com>
Claude-Session: https://claude.ai/code/session_0195XY8VyR4bHAzfsKBhnzYi
</commit_message>
<xml_diff>
--- a/docs/Southwark_Climate_Vulnerability_Note.docx
+++ b/docs/Southwark_Climate_Vulnerability_Note.docx
@@ -236,7 +236,7 @@
           <wp:inline distT="0" distB="0" distL="0" distR="0">
             <wp:extent cx="3960000" cy="2841081"/>
             <wp:effectExtent l="0" t="0" r="0" b="0"/>
-            <wp:docPr id="878825" name="Picture 878825" descr="Two maps of Southwark by LSOA. (a) UHeatRank from 1 (coolest) to 5 (hottest): most of the north and centre is rank 4 or 5. (b) Neighbourhood heat vulnerability from 1 (lower) to 5 (higher): highest in the north-west and centre-north, with clusters in the east and far south; Rotherhithe and most of the south score low."/>
+            <wp:docPr id="23655" name="Picture 23655" descr="Two maps of Southwark by LSOA. (a) UHeatRank from 1 (coolest) to 5 (hottest): most of the north and centre is rank 4 or 5. (b) Neighbourhood heat vulnerability from 1 (lower) to 5 (higher): highest in the north-west and centre-north, with clusters in the east and far south; Rotherhithe and most of the south score low."/>
             <wp:cNvGraphicFramePr>
               <a:graphicFrameLocks xmlns:a="http://schemas.openxmlformats.org/drawingml/2006/main" noChangeAspect="1"/>
             </wp:cNvGraphicFramePr>
@@ -244,7 +244,7 @@
               <a:graphicData uri="http://schemas.openxmlformats.org/drawingml/2006/picture">
                 <pic:pic xmlns:pic="http://schemas.openxmlformats.org/drawingml/2006/picture">
                   <pic:nvPicPr>
-                    <pic:cNvPr id="878825" name="Picture 878825" descr="Two maps of Southwark by LSOA. (a) UHeatRank from 1 (coolest) to 5 (hottest): most of the north and centre is rank 4 or 5. (b) Neighbourhood heat vulnerability from 1 (lower) to 5 (higher): highest in the north-west and centre-north, with clusters in the east and far south; Rotherhithe and most of the south score low."/>
+                    <pic:cNvPr id="23655" name="Picture 23655" descr="Two maps of Southwark by LSOA. (a) UHeatRank from 1 (coolest) to 5 (hottest): most of the north and centre is rank 4 or 5. (b) Neighbourhood heat vulnerability from 1 (lower) to 5 (higher): highest in the north-west and centre-north, with clusters in the east and far south; Rotherhithe and most of the south score low."/>
                     <pic:cNvPicPr/>
                   </pic:nvPicPr>
                   <pic:blipFill>
@@ -350,15 +350,12 @@
         <w:pStyle w:val="Bulletstyle"/>
       </w:pPr>
       <w:r>
-        <w:t xml:space="preserve">all 38 homes in an indoor monitoring sample exceeded 25°C, the level the NHS advises indoor temperatures should not regularly pass</w:t>
-      </w:r>
-    </w:p>
-    <w:p>
-      <w:pPr>
-        <w:pStyle w:val="Bulletstyle"/>
-      </w:pPr>
-      <w:r>
         <w:t xml:space="preserve">rough sleepers, older adults living alone and people with mental health, respiratory or cardiovascular conditions are over-represented among those most affected</w:t>
+      </w:r>
+    </w:p>
+    <w:p>
+      <w:r>
+        <w:t xml:space="preserve">Indoor monitoring bears this out. The Bureau of Investigative Journalism and the Urban Big Data Centre fitted sensors in 40 Southwark homes in summer 2023. Every home reached at least 25°C, the WHO maximum recommended indoor temperature for London, and homes on communal heating ran about 1°C hotter (Bureau of Investigative Journalism, 2023). In the early September heat, 85% exceeded 27°C (University of Glasgow, 2023).</w:t>
       </w:r>
     </w:p>
     <w:p>
@@ -378,7 +375,7 @@
           <wp:inline distT="0" distB="0" distL="0" distR="0">
             <wp:extent cx="2880000" cy="2916340"/>
             <wp:effectExtent l="0" t="0" r="0" b="0"/>
-            <wp:docPr id="447109" name="Picture 447109" descr="Map of Southwark showing green cover (light green) and tree cover (dark green). Cover is dense in the south around Dulwich and sparse across the north, apart from Burgess Park and Southwark Park."/>
+            <wp:docPr id="886692" name="Picture 886692" descr="Map of Southwark showing green cover (light green) and tree cover (dark green). Cover is dense in the south around Dulwich and sparse across the north, apart from Burgess Park and Southwark Park."/>
             <wp:cNvGraphicFramePr>
               <a:graphicFrameLocks xmlns:a="http://schemas.openxmlformats.org/drawingml/2006/main" noChangeAspect="1"/>
             </wp:cNvGraphicFramePr>
@@ -386,7 +383,7 @@
               <a:graphicData uri="http://schemas.openxmlformats.org/drawingml/2006/picture">
                 <pic:pic xmlns:pic="http://schemas.openxmlformats.org/drawingml/2006/picture">
                   <pic:nvPicPr>
-                    <pic:cNvPr id="447109" name="Picture 447109" descr="Map of Southwark showing green cover (light green) and tree cover (dark green). Cover is dense in the south around Dulwich and sparse across the north, apart from Burgess Park and Southwark Park."/>
+                    <pic:cNvPr id="886692" name="Picture 886692" descr="Map of Southwark showing green cover (light green) and tree cover (dark green). Cover is dense in the south around Dulwich and sparse across the north, apart from Burgess Park and Southwark Park."/>
                     <pic:cNvPicPr/>
                   </pic:nvPicPr>
                   <pic:blipFill>
@@ -443,7 +440,7 @@
           <wp:inline distT="0" distB="0" distL="0" distR="0">
             <wp:extent cx="4680000" cy="3705422"/>
             <wp:effectExtent l="0" t="0" r="0" b="0"/>
-            <wp:docPr id="332686" name="Picture 332686" descr="Two street maps of Southwark. (a) Council estates shaded by property heat vulnerability score from 5 to 11: high scores cluster in Walworth, Bermondsey, Camberwell and Peckham. (b) School sites shaded by school heat vulnerability score from 5 to 11: the darkest sites are in Borough, Walworth, Camberwell and Peckham."/>
+            <wp:docPr id="246372" name="Picture 246372" descr="Two street maps of Southwark. (a) Council estates shaded by property heat vulnerability score from 5 to 11: high scores cluster in Walworth, Bermondsey, Camberwell and Peckham. (b) School sites shaded by school heat vulnerability score from 5 to 11: the darkest sites are in Borough, Walworth, Camberwell and Peckham."/>
             <wp:cNvGraphicFramePr>
               <a:graphicFrameLocks xmlns:a="http://schemas.openxmlformats.org/drawingml/2006/main" noChangeAspect="1"/>
             </wp:cNvGraphicFramePr>
@@ -451,7 +448,7 @@
               <a:graphicData uri="http://schemas.openxmlformats.org/drawingml/2006/picture">
                 <pic:pic xmlns:pic="http://schemas.openxmlformats.org/drawingml/2006/picture">
                   <pic:nvPicPr>
-                    <pic:cNvPr id="332686" name="Picture 332686" descr="Two street maps of Southwark. (a) Council estates shaded by property heat vulnerability score from 5 to 11: high scores cluster in Walworth, Bermondsey, Camberwell and Peckham. (b) School sites shaded by school heat vulnerability score from 5 to 11: the darkest sites are in Borough, Walworth, Camberwell and Peckham."/>
+                    <pic:cNvPr id="246372" name="Picture 246372" descr="Two street maps of Southwark. (a) Council estates shaded by property heat vulnerability score from 5 to 11: high scores cluster in Walworth, Bermondsey, Camberwell and Peckham. (b) School sites shaded by school heat vulnerability score from 5 to 11: the darkest sites are in Borough, Walworth, Camberwell and Peckham."/>
                     <pic:cNvPicPr/>
                   </pic:nvPicPr>
                   <pic:blipFill>
@@ -1191,9 +1188,25 @@
     </w:p>
     <w:p>
       <w:r>
+        <w:t xml:space="preserve">Bureau of Investigative Journalism (2023) Revealed: escalating effects of hot summers on UK housing, 5 December. Available at: </w:t>
+      </w:r>
+      <w:hyperlink r:id="rIdLink6" w:history="1">
+        <w:r>
+          <w:rPr>
+            <w:rStyle w:val="Hyperlink"/>
+          </w:rPr>
+          <w:t xml:space="preserve">thebureauinvestigates.com</w:t>
+        </w:r>
+      </w:hyperlink>
+      <w:r>
+        <w:t xml:space="preserve"> (Accessed: 29 September 2026).</w:t>
+      </w:r>
+    </w:p>
+    <w:p>
+      <w:r>
         <w:t xml:space="preserve">Climate Change Committee (2026) CCRA4-IA Technical Report Chapter 4: Built Environment. London: Climate Change Committee. Available at: </w:t>
       </w:r>
-      <w:hyperlink r:id="rIdLink6" w:history="1">
+      <w:hyperlink r:id="rIdLink7" w:history="1">
         <w:r>
           <w:rPr>
             <w:rStyle w:val="Hyperlink"/>
@@ -1209,7 +1222,7 @@
       <w:r>
         <w:t xml:space="preserve">Department for Education (2025) Impact of UK Climate Change Risk on the Delivery of Education: Summary of Findings in Relation to 3 Climate Risks. London: Department for Education. Available at: </w:t>
       </w:r>
-      <w:hyperlink r:id="rIdLink7" w:history="1">
+      <w:hyperlink r:id="rIdLink8" w:history="1">
         <w:r>
           <w:rPr>
             <w:rStyle w:val="Hyperlink"/>
@@ -1225,7 +1238,7 @@
       <w:r>
         <w:t xml:space="preserve">Greater London Authority and Arup (2024) Properties Vulnerable to Heat Impacts in London: Prioritisation for Adaptation Interventions. London: Greater London Authority. Available at: </w:t>
       </w:r>
-      <w:hyperlink r:id="rIdLink8" w:history="1">
+      <w:hyperlink r:id="rIdLink9" w:history="1">
         <w:r>
           <w:rPr>
             <w:rStyle w:val="Hyperlink"/>
@@ -1241,7 +1254,7 @@
       <w:r>
         <w:t xml:space="preserve">Iungman, T. et al. (2023) ’Cooling cities through urban green infrastructure: a health impact assessment of European cities’, The Lancet, 401(10376), pp. 577 to 589. Available at: </w:t>
       </w:r>
-      <w:hyperlink r:id="rIdLink9" w:history="1">
+      <w:hyperlink r:id="rIdLink10" w:history="1">
         <w:r>
           <w:rPr>
             <w:rStyle w:val="Hyperlink"/>
@@ -1266,6 +1279,22 @@
     <w:p>
       <w:r>
         <w:t xml:space="preserve">Southwark Council (2026) Schools Climate Resilience and Extreme Heat Risk Assessment. Internal analysis. London: London Borough of Southwark.</w:t>
+      </w:r>
+    </w:p>
+    <w:p>
+      <w:r>
+        <w:t xml:space="preserve">University of Glasgow (2023) Data analysis reveals concern for UK’s overheating homes, 6 December. Available at: </w:t>
+      </w:r>
+      <w:hyperlink r:id="rIdLink11" w:history="1">
+        <w:r>
+          <w:rPr>
+            <w:rStyle w:val="Hyperlink"/>
+          </w:rPr>
+          <w:t xml:space="preserve">gla.ac.uk</w:t>
+        </w:r>
+      </w:hyperlink>
+      <w:r>
+        <w:t xml:space="preserve"> (Accessed: 29 September 2026).</w:t>
       </w:r>
     </w:p>
     <w:p/>

</xml_diff>

<commit_message>
Verification pass: correct figures and citations in both notes
Co-Authored-By: Claude Opus 5.5 <noreply@anthropic.com>
Claude-Session: https://claude.ai/code/session_0195XY8VyR4bHAzfsKBhnzYi
</commit_message>
<xml_diff>
--- a/docs/Southwark_Climate_Vulnerability_Note.docx
+++ b/docs/Southwark_Climate_Vulnerability_Note.docx
@@ -236,7 +236,7 @@
           <wp:inline distT="0" distB="0" distL="0" distR="0">
             <wp:extent cx="3960000" cy="2841081"/>
             <wp:effectExtent l="0" t="0" r="0" b="0"/>
-            <wp:docPr id="23655" name="Picture 23655" descr="Two maps of Southwark by LSOA. (a) UHeatRank from 1 (coolest) to 5 (hottest): most of the north and centre is rank 4 or 5. (b) Neighbourhood heat vulnerability from 1 (lower) to 5 (higher): highest in the north-west and centre-north, with clusters in the east and far south; Rotherhithe and most of the south score low."/>
+            <wp:docPr id="961760" name="Picture 961760" descr="Two maps of Southwark by LSOA. (a) UHeatRank from 1 (coolest) to 5 (hottest): most of the north and centre is rank 4 or 5. (b) Neighbourhood heat vulnerability from 1 (lower) to 5 (higher): highest in the north-west and centre-north, with clusters in the east and far south; Rotherhithe and most of the south score low."/>
             <wp:cNvGraphicFramePr>
               <a:graphicFrameLocks xmlns:a="http://schemas.openxmlformats.org/drawingml/2006/main" noChangeAspect="1"/>
             </wp:cNvGraphicFramePr>
@@ -244,7 +244,7 @@
               <a:graphicData uri="http://schemas.openxmlformats.org/drawingml/2006/picture">
                 <pic:pic xmlns:pic="http://schemas.openxmlformats.org/drawingml/2006/picture">
                   <pic:nvPicPr>
-                    <pic:cNvPr id="23655" name="Picture 23655" descr="Two maps of Southwark by LSOA. (a) UHeatRank from 1 (coolest) to 5 (hottest): most of the north and centre is rank 4 or 5. (b) Neighbourhood heat vulnerability from 1 (lower) to 5 (higher): highest in the north-west and centre-north, with clusters in the east and far south; Rotherhithe and most of the south score low."/>
+                    <pic:cNvPr id="961760" name="Picture 961760" descr="Two maps of Southwark by LSOA. (a) UHeatRank from 1 (coolest) to 5 (hottest): most of the north and centre is rank 4 or 5. (b) Neighbourhood heat vulnerability from 1 (lower) to 5 (higher): highest in the north-west and centre-north, with clusters in the east and far south; Rotherhithe and most of the south score low."/>
                     <pic:cNvPicPr/>
                   </pic:nvPicPr>
                   <pic:blipFill>
@@ -375,7 +375,7 @@
           <wp:inline distT="0" distB="0" distL="0" distR="0">
             <wp:extent cx="2880000" cy="2916340"/>
             <wp:effectExtent l="0" t="0" r="0" b="0"/>
-            <wp:docPr id="886692" name="Picture 886692" descr="Map of Southwark showing green cover (light green) and tree cover (dark green). Cover is dense in the south around Dulwich and sparse across the north, apart from Burgess Park and Southwark Park."/>
+            <wp:docPr id="806296" name="Picture 806296" descr="Map of Southwark showing green cover (light green) and tree cover (dark green). Cover is dense in the south around Dulwich and sparse across the north, apart from Burgess Park and Southwark Park."/>
             <wp:cNvGraphicFramePr>
               <a:graphicFrameLocks xmlns:a="http://schemas.openxmlformats.org/drawingml/2006/main" noChangeAspect="1"/>
             </wp:cNvGraphicFramePr>
@@ -383,7 +383,7 @@
               <a:graphicData uri="http://schemas.openxmlformats.org/drawingml/2006/picture">
                 <pic:pic xmlns:pic="http://schemas.openxmlformats.org/drawingml/2006/picture">
                   <pic:nvPicPr>
-                    <pic:cNvPr id="886692" name="Picture 886692" descr="Map of Southwark showing green cover (light green) and tree cover (dark green). Cover is dense in the south around Dulwich and sparse across the north, apart from Burgess Park and Southwark Park."/>
+                    <pic:cNvPr id="806296" name="Picture 806296" descr="Map of Southwark showing green cover (light green) and tree cover (dark green). Cover is dense in the south around Dulwich and sparse across the north, apart from Burgess Park and Southwark Park."/>
                     <pic:cNvPicPr/>
                   </pic:nvPicPr>
                   <pic:blipFill>
@@ -440,7 +440,7 @@
           <wp:inline distT="0" distB="0" distL="0" distR="0">
             <wp:extent cx="4680000" cy="3705422"/>
             <wp:effectExtent l="0" t="0" r="0" b="0"/>
-            <wp:docPr id="246372" name="Picture 246372" descr="Two street maps of Southwark. (a) Council estates shaded by property heat vulnerability score from 5 to 11: high scores cluster in Walworth, Bermondsey, Camberwell and Peckham. (b) School sites shaded by school heat vulnerability score from 5 to 11: the darkest sites are in Borough, Walworth, Camberwell and Peckham."/>
+            <wp:docPr id="687380" name="Picture 687380" descr="Two street maps of Southwark. (a) Council estates shaded by property heat vulnerability score from 5 to 11: high scores cluster in Walworth, Bermondsey, Camberwell and Peckham. (b) School sites shaded by school heat vulnerability score from 5 to 11: the darkest sites are in Borough, Walworth, Camberwell and Peckham."/>
             <wp:cNvGraphicFramePr>
               <a:graphicFrameLocks xmlns:a="http://schemas.openxmlformats.org/drawingml/2006/main" noChangeAspect="1"/>
             </wp:cNvGraphicFramePr>
@@ -448,7 +448,7 @@
               <a:graphicData uri="http://schemas.openxmlformats.org/drawingml/2006/picture">
                 <pic:pic xmlns:pic="http://schemas.openxmlformats.org/drawingml/2006/picture">
                   <pic:nvPicPr>
-                    <pic:cNvPr id="246372" name="Picture 246372" descr="Two street maps of Southwark. (a) Council estates shaded by property heat vulnerability score from 5 to 11: high scores cluster in Walworth, Bermondsey, Camberwell and Peckham. (b) School sites shaded by school heat vulnerability score from 5 to 11: the darkest sites are in Borough, Walworth, Camberwell and Peckham."/>
+                    <pic:cNvPr id="687380" name="Picture 687380" descr="Two street maps of Southwark. (a) Council estates shaded by property heat vulnerability score from 5 to 11: high scores cluster in Walworth, Bermondsey, Camberwell and Peckham. (b) School sites shaded by school heat vulnerability score from 5 to 11: the darkest sites are in Borough, Walworth, Camberwell and Peckham."/>
                     <pic:cNvPicPr/>
                   </pic:nvPicPr>
                   <pic:blipFill>
@@ -493,12 +493,12 @@
     </w:p>
     <w:p>
       <w:r>
-        <w:t xml:space="preserve">Southwark is the largest social landlord in London. Much of its stock, including many purpose-built and high-rise flats, predates current ventilation and shading standards: the combination the national assessment rates highest risk (Southwark Council, 2025). The Hot Homes pilot has shortlisted estates using the GLA and Arup data with social heat vulnerability data, and is due for implementation in spring or summer 2027.</w:t>
-      </w:r>
-    </w:p>
-    <w:p>
-      <w:r>
-        <w:t xml:space="preserve">National modelling for the Climate Change Committee compared five adaptation packages, rolled out to the 30% of neighbourhoods at highest risk. BCR is the benefit to cost ratio (Arup, 2026).</w:t>
+        <w:t xml:space="preserve">Southwark is the largest council landlord in London. Much of its stock, including many purpose-built and high-rise flats, predates current ventilation and shading standards: the combination the national assessment rates highest risk (Southwark Council, 2025). The Hot Homes pilot has shortlisted estates using the GLA and Arup data with social heat vulnerability data, and is due for implementation in spring or summer 2027.</w:t>
+      </w:r>
+    </w:p>
+    <w:p>
+      <w:r>
+        <w:t xml:space="preserve">National modelling for the Climate Change Committee compared adaptation packages rolled out to the 30% of neighbourhoods at highest risk. BCR is the benefit to cost ratio (Arup, 2026).</w:t>
       </w:r>
     </w:p>
     <w:tbl>
@@ -1078,7 +1078,7 @@
     </w:tbl>
     <w:p>
       <w:r>
-        <w:t xml:space="preserve">Extending package E to the 45% of neighbourhoods at highest risk keeps heat deaths just below today’s level to 2059, with a benefit to cost ratio of 2.6 (Arup, 2026).</w:t>
+        <w:t xml:space="preserve">Extending package E to the 45% of neighbourhoods at highest risk keeps heat deaths in 2059 just below today’s level, with a benefit to cost ratio of 2.6 (Arup, 2026).</w:t>
       </w:r>
     </w:p>
     <w:p>

</xml_diff>